<commit_message>
Update Modul Ajar: Simplify form, switch to Summernote, update template for import
</commit_message>
<xml_diff>
--- a/storage/app/templates/template_modul_ajar.docx
+++ b/storage/app/templates/template_modul_ajar.docx
@@ -3,19 +3,16 @@
 <w:document xmlns:ve="http://schemas.openxmlformats.org/markup-compatibility/2006" xmlns:o="urn:schemas-microsoft-com:office:office" xmlns:r="http://schemas.openxmlformats.org/officeDocument/2006/relationships" xmlns:m="http://schemas.openxmlformats.org/officeDocument/2006/math" xmlns:v="urn:schemas-microsoft-com:vml" xmlns:wp="http://schemas.openxmlformats.org/drawingml/2006/wordprocessingDrawing" xmlns:w10="urn:schemas-microsoft-com:office:word" xmlns:w="http://schemas.openxmlformats.org/wordprocessingml/2006/main" xmlns:wne="http://schemas.microsoft.com/office/word/2006/wordml">
   <w:body>
     <w:p>
-      <w:bookmarkStart w:id="0" w:name="_Toc0"/>
       <w:r>
         <w:t>TEMPLATE IMPORT MODUL AJAR</w:t>
       </w:r>
-      <w:bookmarkEnd w:id="0"/>
     </w:p>
     <w:p>
       <w:pPr>
         <w:spacing w:after="200"/>
       </w:pPr>
       <w:r>
-        <w:rPr/>
-        <w:t xml:space="preserve">Isi setiap bagian di bawah. Untuk menyisipkan gambar, tempelkan gambar lalu ketik placeholder [IMAGE:caption]. Untuk tabel, ketik [TABLE].</w:t>
+        <w:t xml:space="preserve">Gunakan heading di bawah untuk menandai setiap field. Untuk memasukkan gambar, gunakan menu Insert &gt; Picture atau tempel gambar di dokumen; gambar akan diimpor otomatis. Untuk tabel, gunakan placeholder [TABLE:Judul Tabel] di dalam teks.</w:t>
       </w:r>
     </w:p>
     <w:p>
@@ -23,53 +20,24 @@
         <w:spacing w:after="200"/>
       </w:pPr>
       <w:r>
-        <w:rPr/>
-        <w:t xml:space="preserve"/>
-      </w:r>
-    </w:p>
-    <w:p>
-      <w:pPr>
-        <w:spacing w:after="100"/>
-      </w:pPr>
-      <w:r>
-        <w:rPr>
-          <w:sz w:val="24"/>
-          <w:szCs w:val="24"/>
-          <w:b w:val="1"/>
-          <w:bCs w:val="1"/>
-        </w:rPr>
         <w:t xml:space="preserve">=== Judul Modul Ajar ===</w:t>
       </w:r>
     </w:p>
     <w:p>
-      <w:pPr>
-        <w:spacing w:after="200"/>
-      </w:pPr>
-      <w:r>
-        <w:rPr/>
-        <w:t xml:space="preserve">Modul Ajar Matematika - Konsep Eksponen</w:t>
-      </w:r>
-    </w:p>
-    <w:p>
-      <w:pPr>
-        <w:spacing w:after="100"/>
-      </w:pPr>
-      <w:r>
-        <w:rPr>
-          <w:sz w:val="24"/>
-          <w:szCs w:val="24"/>
-          <w:b w:val="1"/>
-          <w:bCs w:val="1"/>
-        </w:rPr>
+      <w:r>
+        <w:t xml:space="preserve">Contoh Judul Modul Ajar</w:t>
+      </w:r>
+    </w:p>
+    <w:p>
+      <w:pPr>
+        <w:spacing w:after="100"/>
+      </w:pPr>
+      <w:r>
         <w:t xml:space="preserve">=== Mata Pelajaran ===</w:t>
       </w:r>
     </w:p>
     <w:p>
-      <w:pPr>
-        <w:spacing w:after="200"/>
-      </w:pPr>
-      <w:r>
-        <w:rPr/>
+      <w:r>
         <w:t xml:space="preserve">Matematika</w:t>
       </w:r>
     </w:p>
@@ -78,21 +46,11 @@
         <w:spacing w:after="100"/>
       </w:pPr>
       <w:r>
-        <w:rPr>
-          <w:sz w:val="24"/>
-          <w:szCs w:val="24"/>
-          <w:b w:val="1"/>
-          <w:bCs w:val="1"/>
-        </w:rPr>
         <w:t xml:space="preserve">=== Kelas / Fase ===</w:t>
       </w:r>
     </w:p>
     <w:p>
-      <w:pPr>
-        <w:spacing w:after="200"/>
-      </w:pPr>
-      <w:r>
-        <w:rPr/>
+      <w:r>
         <w:t xml:space="preserve">X / Fase E</w:t>
       </w:r>
     </w:p>
@@ -101,21 +59,11 @@
         <w:spacing w:after="100"/>
       </w:pPr>
       <w:r>
-        <w:rPr>
-          <w:sz w:val="24"/>
-          <w:szCs w:val="24"/>
-          <w:b w:val="1"/>
-          <w:bCs w:val="1"/>
-        </w:rPr>
         <w:t xml:space="preserve">=== Status ===</w:t>
       </w:r>
     </w:p>
     <w:p>
-      <w:pPr>
-        <w:spacing w:after="200"/>
-      </w:pPr>
-      <w:r>
-        <w:rPr/>
+      <w:r>
         <w:t xml:space="preserve">Draft</w:t>
       </w:r>
     </w:p>
@@ -124,21 +72,11 @@
         <w:spacing w:after="100"/>
       </w:pPr>
       <w:r>
-        <w:rPr>
-          <w:sz w:val="24"/>
-          <w:szCs w:val="24"/>
-          <w:b w:val="1"/>
-          <w:bCs w:val="1"/>
-        </w:rPr>
         <w:t xml:space="preserve">=== Alokasi Waktu ===</w:t>
       </w:r>
     </w:p>
     <w:p>
-      <w:pPr>
-        <w:spacing w:after="200"/>
-      </w:pPr>
-      <w:r>
-        <w:rPr/>
+      <w:r>
         <w:t xml:space="preserve">2 JP (2 x 45 menit)</w:t>
       </w:r>
     </w:p>
@@ -147,264 +85,143 @@
         <w:spacing w:after="100"/>
       </w:pPr>
       <w:r>
-        <w:rPr>
-          <w:sz w:val="24"/>
-          <w:szCs w:val="24"/>
-          <w:b w:val="1"/>
-          <w:bCs w:val="1"/>
-        </w:rPr>
         <w:t xml:space="preserve">=== Capaian Pembelajaran ===</w:t>
       </w:r>
     </w:p>
     <w:p>
-      <w:pPr>
-        <w:spacing w:after="200"/>
-      </w:pPr>
-      <w:r>
-        <w:rPr/>
-        <w:t xml:space="preserve">Di akhir fase E, peserta didik dapat menggeneralisasi sifat-sifat operasi bilangan berpangkat.
-[IMAGE:Ilustrasi sifat eksponen]</w:t>
-      </w:r>
-    </w:p>
-    <w:p>
-      <w:pPr>
-        <w:spacing w:after="100"/>
-      </w:pPr>
-      <w:r>
-        <w:rPr>
-          <w:sz w:val="24"/>
-          <w:szCs w:val="24"/>
-          <w:b w:val="1"/>
-          <w:bCs w:val="1"/>
-        </w:rPr>
+      <w:r>
+        <w:t xml:space="preserve">Peserta didik mampu menjelaskan konsep… [IMAGE:Contoh Grafik]</w:t>
+      </w:r>
+    </w:p>
+    <w:p>
+      <w:pPr>
+        <w:spacing w:after="100"/>
+      </w:pPr>
+      <w:r>
         <w:t xml:space="preserve">=== Tujuan Pembelajaran ===</w:t>
       </w:r>
     </w:p>
     <w:p>
-      <w:pPr>
-        <w:spacing w:after="200"/>
-      </w:pPr>
-      <w:r>
-        <w:rPr/>
-        <w:t xml:space="preserve">Peserta didik mampu mengidentifikasi bentuk umum fungsi eksponen.
-Peserta didik mampu memodelkan masalah nyata menggunakan fungsi eksponen.
-[TABLE:Tujuan pembelajaran]</w:t>
-      </w:r>
-    </w:p>
-    <w:p>
-      <w:pPr>
-        <w:spacing w:after="100"/>
-      </w:pPr>
-      <w:r>
-        <w:rPr>
-          <w:sz w:val="24"/>
-          <w:szCs w:val="24"/>
-          <w:b w:val="1"/>
-          <w:bCs w:val="1"/>
-        </w:rPr>
+      <w:r>
+        <w:t xml:space="preserve">1. Mengidentifikasi…
+2. Menggunakan… [TABLE:Tujuan Pembelajaran]</w:t>
+      </w:r>
+    </w:p>
+    <w:p>
+      <w:pPr>
+        <w:spacing w:after="100"/>
+      </w:pPr>
+      <w:r>
         <w:t xml:space="preserve">=== Metode Pembelajaran ===</w:t>
       </w:r>
     </w:p>
     <w:p>
-      <w:pPr>
-        <w:spacing w:after="200"/>
-      </w:pPr>
-      <w:r>
-        <w:rPr/>
-        <w:t xml:space="preserve">Ceramah interaktif
-Diskusi kelompok
-Tanya jawab</w:t>
-      </w:r>
-    </w:p>
-    <w:p>
-      <w:pPr>
-        <w:spacing w:after="100"/>
-      </w:pPr>
-      <w:r>
-        <w:rPr>
-          <w:sz w:val="24"/>
-          <w:szCs w:val="24"/>
-          <w:b w:val="1"/>
-          <w:bCs w:val="1"/>
-        </w:rPr>
+      <w:r>
+        <w:t xml:space="preserve">Diskusi, kerja kelompok, simulasi.</w:t>
+      </w:r>
+    </w:p>
+    <w:p>
+      <w:pPr>
+        <w:spacing w:after="100"/>
+      </w:pPr>
+      <w:r>
         <w:t xml:space="preserve">=== Media Pembelajaran ===</w:t>
       </w:r>
     </w:p>
     <w:p>
-      <w:pPr>
-        <w:spacing w:after="200"/>
-      </w:pPr>
-      <w:r>
-        <w:rPr/>
-        <w:t xml:space="preserve">GeoGebra
-Slide PowerPoint
-[IMAGE:Contoh slide GeoGebra]
-Video pembelajaran</w:t>
-      </w:r>
-    </w:p>
-    <w:p>
-      <w:pPr>
-        <w:spacing w:after="100"/>
-      </w:pPr>
-      <w:r>
-        <w:rPr>
-          <w:sz w:val="24"/>
-          <w:szCs w:val="24"/>
-          <w:b w:val="1"/>
-          <w:bCs w:val="1"/>
-        </w:rPr>
+      <w:r>
+        <w:t xml:space="preserve">Buku, video, alat peraga. [IMAGE:Media Pembelajaran]</w:t>
+      </w:r>
+    </w:p>
+    <w:p>
+      <w:pPr>
+        <w:spacing w:after="100"/>
+      </w:pPr>
+      <w:r>
         <w:t xml:space="preserve">=== Sumber Belajar ===</w:t>
       </w:r>
     </w:p>
     <w:p>
-      <w:pPr>
-        <w:spacing w:after="200"/>
-      </w:pPr>
-      <w:r>
-        <w:rPr/>
-        <w:t xml:space="preserve">Buku teks
-LKPD
-Website interaktif</w:t>
-      </w:r>
-    </w:p>
-    <w:p>
-      <w:pPr>
-        <w:spacing w:after="100"/>
-      </w:pPr>
-      <w:r>
-        <w:rPr>
-          <w:sz w:val="24"/>
-          <w:szCs w:val="24"/>
-          <w:b w:val="1"/>
-          <w:bCs w:val="1"/>
-        </w:rPr>
+      <w:r>
+        <w:t xml:space="preserve">Referensi buku, website, LKS.</w:t>
+      </w:r>
+    </w:p>
+    <w:p>
+      <w:pPr>
+        <w:spacing w:after="100"/>
+      </w:pPr>
+      <w:r>
         <w:t xml:space="preserve">=== Praktik Pedagogis ===</w:t>
       </w:r>
     </w:p>
     <w:p>
-      <w:pPr>
-        <w:spacing w:after="200"/>
-      </w:pPr>
-      <w:r>
-        <w:rPr/>
-        <w:t xml:space="preserve">Model Pembelajaran: Problem-Based Learning (PBL).
-[IMAGE:Langkah PBL]</w:t>
-      </w:r>
-    </w:p>
-    <w:p>
-      <w:pPr>
-        <w:spacing w:after="100"/>
-      </w:pPr>
-      <w:r>
-        <w:rPr>
-          <w:sz w:val="24"/>
-          <w:szCs w:val="24"/>
-          <w:b w:val="1"/>
-          <w:bCs w:val="1"/>
-        </w:rPr>
+      <w:r>
+        <w:t xml:space="preserve">Pembelajaran berbasis proyek dan refleksi.</w:t>
+      </w:r>
+    </w:p>
+    <w:p>
+      <w:pPr>
+        <w:spacing w:after="100"/>
+      </w:pPr>
+      <w:r>
         <w:t xml:space="preserve">=== Lingkungan Pembelajaran ===</w:t>
       </w:r>
     </w:p>
     <w:p>
-      <w:pPr>
-        <w:spacing w:after="200"/>
-      </w:pPr>
-      <w:r>
-        <w:rPr/>
-        <w:t xml:space="preserve">Ruang kelas fleksibel dan dukungan internet.</w:t>
-      </w:r>
-    </w:p>
-    <w:p>
-      <w:pPr>
-        <w:spacing w:after="100"/>
-      </w:pPr>
-      <w:r>
-        <w:rPr>
-          <w:sz w:val="24"/>
-          <w:szCs w:val="24"/>
-          <w:b w:val="1"/>
-          <w:bCs w:val="1"/>
-        </w:rPr>
+      <w:r>
+        <w:t xml:space="preserve">Lingkungan kelas inklusif dan digital.</w:t>
+      </w:r>
+    </w:p>
+    <w:p>
+      <w:pPr>
+        <w:spacing w:after="100"/>
+      </w:pPr>
+      <w:r>
         <w:t xml:space="preserve">=== Pemanfaatan Digital ===</w:t>
       </w:r>
     </w:p>
     <w:p>
-      <w:pPr>
-        <w:spacing w:after="200"/>
-      </w:pPr>
-      <w:r>
-        <w:rPr/>
-        <w:t xml:space="preserve">GeoGebra dan LMS sekolah.</w:t>
-      </w:r>
-    </w:p>
-    <w:p>
-      <w:pPr>
-        <w:spacing w:after="100"/>
-      </w:pPr>
-      <w:r>
-        <w:rPr>
-          <w:sz w:val="24"/>
-          <w:szCs w:val="24"/>
-          <w:b w:val="1"/>
-          <w:bCs w:val="1"/>
-        </w:rPr>
+      <w:r>
+        <w:t xml:space="preserve">Aplikasi pembelajaran daring.</w:t>
+      </w:r>
+    </w:p>
+    <w:p>
+      <w:pPr>
+        <w:spacing w:after="100"/>
+      </w:pPr>
+      <w:r>
         <w:t xml:space="preserve">=== Pengalaman Pembelajaran ===</w:t>
       </w:r>
     </w:p>
     <w:p>
-      <w:pPr>
-        <w:spacing w:after="200"/>
-      </w:pPr>
-      <w:r>
-        <w:rPr/>
-        <w:t xml:space="preserve">Pendahuluan, inti, penutup.</w:t>
-      </w:r>
-    </w:p>
-    <w:p>
-      <w:pPr>
-        <w:spacing w:after="100"/>
-      </w:pPr>
-      <w:r>
-        <w:rPr>
-          <w:sz w:val="24"/>
-          <w:szCs w:val="24"/>
-          <w:b w:val="1"/>
-          <w:bCs w:val="1"/>
-        </w:rPr>
+      <w:r>
+        <w:t xml:space="preserve">Kegiatan pembelajaran dan refleksi.</w:t>
+      </w:r>
+    </w:p>
+    <w:p>
+      <w:pPr>
+        <w:spacing w:after="100"/>
+      </w:pPr>
+      <w:r>
         <w:t xml:space="preserve">=== Refleksi Pembelajaran ===</w:t>
       </w:r>
     </w:p>
     <w:p>
-      <w:pPr>
-        <w:spacing w:after="200"/>
-      </w:pPr>
-      <w:r>
-        <w:rPr/>
-        <w:t xml:space="preserve">Refleksi guru dan peserta didik.</w:t>
-      </w:r>
-    </w:p>
-    <w:p>
-      <w:pPr>
-        <w:spacing w:after="100"/>
-      </w:pPr>
-      <w:r>
-        <w:rPr>
-          <w:sz w:val="24"/>
-          <w:szCs w:val="24"/>
-          <w:b w:val="1"/>
-          <w:bCs w:val="1"/>
-        </w:rPr>
+      <w:r>
+        <w:t xml:space="preserve">Refleksi guru dan siswa.</w:t>
+      </w:r>
+    </w:p>
+    <w:p>
+      <w:pPr>
+        <w:spacing w:after="100"/>
+      </w:pPr>
+      <w:r>
         <w:t xml:space="preserve">=== Asesmen ===</w:t>
       </w:r>
     </w:p>
     <w:p>
-      <w:pPr>
-        <w:spacing w:after="200"/>
-      </w:pPr>
-      <w:r>
-        <w:rPr/>
-        <w:t xml:space="preserve">Asesmen diagnostik, formatif, dan sumatif.
-[TABLE:Rubrik asesmen]</w:t>
+      <w:r>
+        <w:t xml:space="preserve">Asesmen formatif dan sumatif. [TABLE:Rubrik Asesmen]</w:t>
       </w:r>
     </w:p>
     <w:sectPr>

</xml_diff>

<commit_message>
Update Word template to match exactly the exact fields
</commit_message>
<xml_diff>
--- a/storage/app/templates/template_modul_ajar.docx
+++ b/storage/app/templates/template_modul_ajar.docx
@@ -1,234 +1,106 @@
 
 <file path=word/document.xml><?xml version="1.0" encoding="utf-8"?>
-<w:document xmlns:ve="http://schemas.openxmlformats.org/markup-compatibility/2006" xmlns:o="urn:schemas-microsoft-com:office:office" xmlns:r="http://schemas.openxmlformats.org/officeDocument/2006/relationships" xmlns:m="http://schemas.openxmlformats.org/officeDocument/2006/math" xmlns:v="urn:schemas-microsoft-com:vml" xmlns:wp="http://schemas.openxmlformats.org/drawingml/2006/wordprocessingDrawing" xmlns:w10="urn:schemas-microsoft-com:office:word" xmlns:w="http://schemas.openxmlformats.org/wordprocessingml/2006/main" xmlns:wne="http://schemas.microsoft.com/office/word/2006/wordml">
+<w:document xmlns:w="http://schemas.openxmlformats.org/wordprocessingml/2006/main">
   <w:body>
     <w:p>
       <w:r>
-        <w:t>TEMPLATE IMPORT MODUL AJAR</w:t>
-      </w:r>
-    </w:p>
-    <w:p>
-      <w:pPr>
-        <w:spacing w:after="200"/>
-      </w:pPr>
-      <w:r>
-        <w:t xml:space="preserve">Gunakan heading di bawah untuk menandai setiap field. Untuk memasukkan gambar, gunakan menu Insert &gt; Picture atau tempel gambar di dokumen; gambar akan diimpor otomatis. Untuk tabel, gunakan placeholder [TABLE:Judul Tabel] di dalam teks.</w:t>
-      </w:r>
-    </w:p>
-    <w:p>
-      <w:pPr>
-        <w:spacing w:after="200"/>
-      </w:pPr>
-      <w:r>
-        <w:t xml:space="preserve">=== Judul Modul Ajar ===</w:t>
-      </w:r>
-    </w:p>
-    <w:p>
-      <w:r>
-        <w:t xml:space="preserve">Contoh Judul Modul Ajar</w:t>
-      </w:r>
-    </w:p>
-    <w:p>
-      <w:pPr>
-        <w:spacing w:after="100"/>
-      </w:pPr>
-      <w:r>
-        <w:t xml:space="preserve">=== Mata Pelajaran ===</w:t>
-      </w:r>
-    </w:p>
-    <w:p>
-      <w:r>
-        <w:t xml:space="preserve">Matematika</w:t>
-      </w:r>
-    </w:p>
-    <w:p>
-      <w:pPr>
-        <w:spacing w:after="100"/>
-      </w:pPr>
-      <w:r>
-        <w:t xml:space="preserve">=== Kelas / Fase ===</w:t>
-      </w:r>
-    </w:p>
-    <w:p>
-      <w:r>
-        <w:t xml:space="preserve">X / Fase E</w:t>
-      </w:r>
-    </w:p>
-    <w:p>
-      <w:pPr>
-        <w:spacing w:after="100"/>
-      </w:pPr>
-      <w:r>
-        <w:t xml:space="preserve">=== Status ===</w:t>
-      </w:r>
-    </w:p>
-    <w:p>
-      <w:r>
-        <w:t xml:space="preserve">Draft</w:t>
-      </w:r>
-    </w:p>
-    <w:p>
-      <w:pPr>
-        <w:spacing w:after="100"/>
-      </w:pPr>
-      <w:r>
-        <w:t xml:space="preserve">=== Alokasi Waktu ===</w:t>
-      </w:r>
-    </w:p>
-    <w:p>
-      <w:r>
-        <w:t xml:space="preserve">2 JP (2 x 45 menit)</w:t>
-      </w:r>
-    </w:p>
-    <w:p>
-      <w:pPr>
-        <w:spacing w:after="100"/>
-      </w:pPr>
-      <w:r>
-        <w:t xml:space="preserve">=== Capaian Pembelajaran ===</w:t>
-      </w:r>
-    </w:p>
-    <w:p>
-      <w:r>
-        <w:t xml:space="preserve">Peserta didik mampu menjelaskan konsep… [IMAGE:Contoh Grafik]</w:t>
-      </w:r>
-    </w:p>
-    <w:p>
-      <w:pPr>
-        <w:spacing w:after="100"/>
-      </w:pPr>
-      <w:r>
-        <w:t xml:space="preserve">=== Tujuan Pembelajaran ===</w:t>
-      </w:r>
-    </w:p>
-    <w:p>
-      <w:r>
-        <w:t xml:space="preserve">1. Mengidentifikasi…
-2. Menggunakan… [TABLE:Tujuan Pembelajaran]</w:t>
-      </w:r>
-    </w:p>
-    <w:p>
-      <w:pPr>
-        <w:spacing w:after="100"/>
-      </w:pPr>
-      <w:r>
-        <w:t xml:space="preserve">=== Metode Pembelajaran ===</w:t>
-      </w:r>
-    </w:p>
-    <w:p>
-      <w:r>
-        <w:t xml:space="preserve">Diskusi, kerja kelompok, simulasi.</w:t>
-      </w:r>
-    </w:p>
-    <w:p>
-      <w:pPr>
-        <w:spacing w:after="100"/>
-      </w:pPr>
-      <w:r>
-        <w:t xml:space="preserve">=== Media Pembelajaran ===</w:t>
-      </w:r>
-    </w:p>
-    <w:p>
-      <w:r>
-        <w:t xml:space="preserve">Buku, video, alat peraga. [IMAGE:Media Pembelajaran]</w:t>
-      </w:r>
-    </w:p>
-    <w:p>
-      <w:pPr>
-        <w:spacing w:after="100"/>
-      </w:pPr>
-      <w:r>
-        <w:t xml:space="preserve">=== Sumber Belajar ===</w:t>
-      </w:r>
-    </w:p>
-    <w:p>
-      <w:r>
-        <w:t xml:space="preserve">Referensi buku, website, LKS.</w:t>
-      </w:r>
-    </w:p>
-    <w:p>
-      <w:pPr>
-        <w:spacing w:after="100"/>
-      </w:pPr>
-      <w:r>
-        <w:t xml:space="preserve">=== Praktik Pedagogis ===</w:t>
-      </w:r>
-    </w:p>
-    <w:p>
-      <w:r>
-        <w:t xml:space="preserve">Pembelajaran berbasis proyek dan refleksi.</w:t>
-      </w:r>
-    </w:p>
-    <w:p>
-      <w:pPr>
-        <w:spacing w:after="100"/>
-      </w:pPr>
-      <w:r>
-        <w:t xml:space="preserve">=== Lingkungan Pembelajaran ===</w:t>
-      </w:r>
-    </w:p>
-    <w:p>
-      <w:r>
-        <w:t xml:space="preserve">Lingkungan kelas inklusif dan digital.</w:t>
-      </w:r>
-    </w:p>
-    <w:p>
-      <w:pPr>
-        <w:spacing w:after="100"/>
-      </w:pPr>
-      <w:r>
-        <w:t xml:space="preserve">=== Pemanfaatan Digital ===</w:t>
-      </w:r>
-    </w:p>
-    <w:p>
-      <w:r>
-        <w:t xml:space="preserve">Aplikasi pembelajaran daring.</w:t>
-      </w:r>
-    </w:p>
-    <w:p>
-      <w:pPr>
-        <w:spacing w:after="100"/>
-      </w:pPr>
-      <w:r>
-        <w:t xml:space="preserve">=== Pengalaman Pembelajaran ===</w:t>
-      </w:r>
-    </w:p>
-    <w:p>
-      <w:r>
-        <w:t xml:space="preserve">Kegiatan pembelajaran dan refleksi.</w:t>
-      </w:r>
-    </w:p>
-    <w:p>
-      <w:pPr>
-        <w:spacing w:after="100"/>
-      </w:pPr>
-      <w:r>
-        <w:t xml:space="preserve">=== Refleksi Pembelajaran ===</w:t>
-      </w:r>
-    </w:p>
-    <w:p>
-      <w:r>
-        <w:t xml:space="preserve">Refleksi guru dan siswa.</w:t>
-      </w:r>
-    </w:p>
-    <w:p>
-      <w:pPr>
-        <w:spacing w:after="100"/>
-      </w:pPr>
-      <w:r>
-        <w:t xml:space="preserve">=== Asesmen ===</w:t>
-      </w:r>
-    </w:p>
-    <w:p>
-      <w:r>
-        <w:t xml:space="preserve">Asesmen formatif dan sumatif. [TABLE:Rubrik Asesmen]</w:t>
-      </w:r>
-    </w:p>
-    <w:sectPr>
-      <w:pgSz w:orient="portrait" w:w="11905.511811023622" w:h="16837.79527559055"/>
-      <w:pgMar w:top="1440" w:right="1440" w:bottom="1440" w:left="1440" w:header="720" w:footer="720" w:gutter="0"/>
-      <w:cols w:num="1" w:space="720"/>
-    </w:sectPr>
+        <w:t>Template Import Modul Ajar</w:t>
+      </w:r>
+    </w:p>
+    <w:p>
+      <w:r>
+        <w:t>Isi bagian-bagian di bawah ini. Jangan ubah teks huruf besar yang menjadi judul (misal: CAPAIAN PEMBELAJARAN).</w:t>
+      </w:r>
+    </w:p>
+    <w:p/>
+    <w:p>
+      <w:r>
+        <w:t>CAPAIAN PEMBELAJARAN</w:t>
+      </w:r>
+    </w:p>
+    <w:p>
+      <w:r>
+        <w:t>Tuliskan capaian pembelajaran di sini...</w:t>
+      </w:r>
+    </w:p>
+    <w:p/>
+    <w:p>
+      <w:r>
+        <w:t>TUJUAN PEMBELAJARAN</w:t>
+      </w:r>
+    </w:p>
+    <w:p>
+      <w:r>
+        <w:t>Tuliskan tujuan pembelajaran di sini...</w:t>
+      </w:r>
+    </w:p>
+    <w:p/>
+    <w:p>
+      <w:r>
+        <w:t>PRAKTIK PEDAGOGIS</w:t>
+      </w:r>
+    </w:p>
+    <w:p>
+      <w:r>
+        <w:t>Tuliskan praktik pedagogis di sini...</w:t>
+      </w:r>
+    </w:p>
+    <w:p/>
+    <w:p>
+      <w:r>
+        <w:t>LINGKUNGAN PEMBELAJARAN</w:t>
+      </w:r>
+    </w:p>
+    <w:p>
+      <w:r>
+        <w:t>Tuliskan lingkungan pembelajaran di sini...</w:t>
+      </w:r>
+    </w:p>
+    <w:p/>
+    <w:p>
+      <w:r>
+        <w:t>PEMANFAATAN DIGITAL</w:t>
+      </w:r>
+    </w:p>
+    <w:p>
+      <w:r>
+        <w:t>Tuliskan pemanfaatan digital di sini...</w:t>
+      </w:r>
+    </w:p>
+    <w:p/>
+    <w:p>
+      <w:r>
+        <w:t>PENGALAMAN PEMBELAJARAN</w:t>
+      </w:r>
+    </w:p>
+    <w:p>
+      <w:r>
+        <w:t>Tuliskan pengalaman pembelajaran di sini...</w:t>
+      </w:r>
+    </w:p>
+    <w:p/>
+    <w:p>
+      <w:r>
+        <w:t>REFLEKSI PEMBELAJARAN</w:t>
+      </w:r>
+    </w:p>
+    <w:p>
+      <w:r>
+        <w:t>Tuliskan refleksi pembelajaran di sini...</w:t>
+      </w:r>
+    </w:p>
+    <w:p/>
+    <w:p>
+      <w:r>
+        <w:t>ASESMEN</w:t>
+      </w:r>
+    </w:p>
+    <w:p>
+      <w:r>
+        <w:t>Tuliskan asesmen di sini...</w:t>
+      </w:r>
+    </w:p>
+    <w:sectPr/>
   </w:body>
 </w:document>
 </file>

</xml_diff>

<commit_message>
Update Word template to match parser logic (include === markers)
</commit_message>
<xml_diff>
--- a/storage/app/templates/template_modul_ajar.docx
+++ b/storage/app/templates/template_modul_ajar.docx
@@ -9,13 +9,13 @@
     </w:p>
     <w:p>
       <w:r>
-        <w:t>Isi bagian-bagian di bawah ini. Jangan ubah teks huruf besar yang menjadi judul (misal: CAPAIAN PEMBELAJARAN).</w:t>
-      </w:r>
-    </w:p>
-    <w:p/>
-    <w:p>
-      <w:r>
-        <w:t>CAPAIAN PEMBELAJARAN</w:t>
+        <w:t>Isi bagian-bagian di bawah ini. Jangan ubah teks yang diapit oleh === (contoh: === CAPAIAN PEMBELAJARAN ===).</w:t>
+      </w:r>
+    </w:p>
+    <w:p/>
+    <w:p>
+      <w:r>
+        <w:t>=== CAPAIAN PEMBELAJARAN ===</w:t>
       </w:r>
     </w:p>
     <w:p>
@@ -26,7 +26,7 @@
     <w:p/>
     <w:p>
       <w:r>
-        <w:t>TUJUAN PEMBELAJARAN</w:t>
+        <w:t>=== TUJUAN PEMBELAJARAN ===</w:t>
       </w:r>
     </w:p>
     <w:p>
@@ -37,7 +37,7 @@
     <w:p/>
     <w:p>
       <w:r>
-        <w:t>PRAKTIK PEDAGOGIS</w:t>
+        <w:t>=== PRAKTIK PEDAGOGIS ===</w:t>
       </w:r>
     </w:p>
     <w:p>
@@ -48,7 +48,7 @@
     <w:p/>
     <w:p>
       <w:r>
-        <w:t>LINGKUNGAN PEMBELAJARAN</w:t>
+        <w:t>=== LINGKUNGAN PEMBELAJARAN ===</w:t>
       </w:r>
     </w:p>
     <w:p>
@@ -59,7 +59,7 @@
     <w:p/>
     <w:p>
       <w:r>
-        <w:t>PEMANFAATAN DIGITAL</w:t>
+        <w:t>=== PEMANFAATAN DIGITAL ===</w:t>
       </w:r>
     </w:p>
     <w:p>
@@ -70,7 +70,7 @@
     <w:p/>
     <w:p>
       <w:r>
-        <w:t>PENGALAMAN PEMBELAJARAN</w:t>
+        <w:t>=== PENGALAMAN PEMBELAJARAN ===</w:t>
       </w:r>
     </w:p>
     <w:p>
@@ -81,7 +81,7 @@
     <w:p/>
     <w:p>
       <w:r>
-        <w:t>REFLEKSI PEMBELAJARAN</w:t>
+        <w:t>=== REFLEKSI PEMBELAJARAN ===</w:t>
       </w:r>
     </w:p>
     <w:p>
@@ -92,7 +92,7 @@
     <w:p/>
     <w:p>
       <w:r>
-        <w:t>ASESMEN</w:t>
+        <w:t>=== ASESMEN ===</w:t>
       </w:r>
     </w:p>
     <w:p>

</xml_diff>

<commit_message>
Update default values in Modul Ajar
</commit_message>
<xml_diff>
--- a/storage/app/templates/template_modul_ajar.docx
+++ b/storage/app/templates/template_modul_ajar.docx
@@ -53,7 +53,7 @@
     </w:p>
     <w:p>
       <w:r>
-        <w:t>Tuliskan lingkungan pembelajaran di sini...</w:t>
+        <w:t>Keterangan : Ruang fisik, Ruang Virtual, Budaya Belajar</w:t>
       </w:r>
     </w:p>
     <w:p/>
@@ -64,7 +64,7 @@
     </w:p>
     <w:p>
       <w:r>
-        <w:t>Tuliskan pemanfaatan digital di sini...</w:t>
+        <w:t>Keterangan : Tuliskan Sumber Belajar baik berupa buku sumber maupun elektronik</w:t>
       </w:r>
     </w:p>
     <w:p/>
@@ -75,7 +75,7 @@
     </w:p>
     <w:p>
       <w:r>
-        <w:t>Tuliskan pengalaman pembelajaran di sini...</w:t>
+        <w:t>Pendahuluan, Kegiatan Inti dan Kegiatan Penutup</w:t>
       </w:r>
     </w:p>
     <w:p/>

</xml_diff>

<commit_message>
Update default hints for Capaian, Tujuan and Praktik
</commit_message>
<xml_diff>
--- a/storage/app/templates/template_modul_ajar.docx
+++ b/storage/app/templates/template_modul_ajar.docx
@@ -20,7 +20,7 @@
     </w:p>
     <w:p>
       <w:r>
-        <w:t>Tuliskan capaian pembelajaran di sini...</w:t>
+        <w:t>[Tuliskan Capaian pembelajaran untuk masing-masing mapel berdasarkan Kep BSKAP 046/2025 (bagi mapel umum) dan Kep BKPDM 020/2026 (bagi mapel PAI dan Budi Pekerti)]</w:t>
       </w:r>
     </w:p>
     <w:p/>
@@ -31,7 +31,7 @@
     </w:p>
     <w:p>
       <w:r>
-        <w:t>Tuliskan tujuan pembelajaran di sini...</w:t>
+        <w:t>[Sebutkan Tujuan pembelajaran yang mengacu pada capaian pembelajaran]</w:t>
       </w:r>
     </w:p>
     <w:p/>
@@ -42,7 +42,7 @@
     </w:p>
     <w:p>
       <w:r>
-        <w:t>Tuliskan praktik pedagogis di sini...</w:t>
+        <w:t>[Jelaskan metode dan Model pembelajaran yang akan digunakan...]</w:t>
       </w:r>
     </w:p>
     <w:p/>

</xml_diff>